<commit_message>
pre further costs sofistication
</commit_message>
<xml_diff>
--- a/model_beskrivelse.docx
+++ b/model_beskrivelse.docx
@@ -315,7 +315,124 @@
     </w:p>
     <w:p>
       <w:r>
-        <w:t xml:space="preserve">Her optimeres kapaciteterne for sol, vind og batteri (effekt og energi) simultant som ét lineært program (LP). Modellen vælger i hvert af årets 8.760 timer, hvad der lades op, aflades, importeres og eksporteres — al dette optimeres på én gang. VE-løsningens økonomi afhænger stærkt af </w:t>
+        <w:t xml:space="preserve">Operatøren dimensionerer tre anlægskomponenter: installeret effekt i sol og vind (MW) samt batteriets effektkapacitet (MW) og energikapacitet (MWh, sat til </w:t>
+      </w:r>
+      <w:r>
+        <w:t>4</w:t>
+      </w:r>
+      <w:r>
+        <w:t xml:space="preserve"> timers varighed). For hvert af årets 8.760 timer vælges desuden, hvordan energien disponeres: opladning og afladning af batteriet, køb og salg til nettet samt eventuel curtailment af VE-overskud. Alle disse beslutninger — kapaciteter og timebeslutninger — optimeres simultant som ét lineært program med det formål at minimere de samlede </w:t>
+      </w:r>
+      <w:proofErr w:type="spellStart"/>
+      <w:r>
+        <w:t>annualiserede</w:t>
+      </w:r>
+      <w:proofErr w:type="spellEnd"/>
+      <w:r>
+        <w:t xml:space="preserve"> omkostninger.</w:t>
+      </w:r>
+      <w:r>
+        <w:t xml:space="preserve"> </w:t>
+      </w:r>
+      <w:r>
+        <w:t>Operatøren er underlagt følgende rammer i hver time:</w:t>
+      </w:r>
+    </w:p>
+    <w:p>
+      <w:pPr>
+        <w:pStyle w:val="ListParagraph"/>
+        <w:numPr>
+          <w:ilvl w:val="0"/>
+          <w:numId w:val="1"/>
+        </w:numPr>
+      </w:pPr>
+      <w:r>
+        <w:t xml:space="preserve">On-site-krav: Nettoimport kan højst udgøre </w:t>
+      </w:r>
+      <m:oMath>
+        <m:r>
+          <w:rPr>
+            <w:rFonts w:ascii="Cambria Math" w:hAnsi="Cambria Math"/>
+          </w:rPr>
+          <m:t>(1 - x) · 1.000 MW</m:t>
+        </m:r>
+      </m:oMath>
+      <w:r>
+        <w:t>. Kravet gælder timen, ikke året — det er altså ikke muligt at importere mere om vinteren og kompensere med overskud om sommeren.</w:t>
+      </w:r>
+    </w:p>
+    <w:p>
+      <w:pPr>
+        <w:pStyle w:val="ListParagraph"/>
+        <w:numPr>
+          <w:ilvl w:val="0"/>
+          <w:numId w:val="1"/>
+        </w:numPr>
+      </w:pPr>
+      <w:r>
+        <w:t xml:space="preserve">Eksportloft: Salg til nettet er tilladt, men begrænset til </w:t>
+      </w:r>
+      <m:oMath>
+        <m:r>
+          <w:rPr>
+            <w:rFonts w:ascii="Cambria Math" w:hAnsi="Cambria Math"/>
+          </w:rPr>
+          <m:t>(1 - x) · 1.000 MW</m:t>
+        </m:r>
+      </m:oMath>
+      <w:r>
+        <w:t xml:space="preserve"> pr. time.</w:t>
+      </w:r>
+    </w:p>
+    <w:p>
+      <w:pPr>
+        <w:pStyle w:val="ListParagraph"/>
+        <w:numPr>
+          <w:ilvl w:val="0"/>
+          <w:numId w:val="1"/>
+        </w:numPr>
+      </w:pPr>
+      <w:r>
+        <w:t xml:space="preserve">Batteriet er fuldstændig </w:t>
+      </w:r>
+      <w:proofErr w:type="spellStart"/>
+      <w:r>
+        <w:t>bidirektionalt</w:t>
+      </w:r>
+      <w:proofErr w:type="spellEnd"/>
+      <w:r>
+        <w:t xml:space="preserve">: Det må oplade fra både VE-overskud og </w:t>
+      </w:r>
+      <w:proofErr w:type="spellStart"/>
+      <w:r>
+        <w:t>netimport</w:t>
+      </w:r>
+      <w:proofErr w:type="spellEnd"/>
+      <w:r>
+        <w:t xml:space="preserve"> og aflade til både datacentret og nettet. Der er ingen restriktion på retning —</w:t>
+      </w:r>
+      <w:r>
+        <w:t xml:space="preserve"> operatøren</w:t>
+      </w:r>
+      <w:r>
+        <w:t xml:space="preserve"> bestemmer selv, hvornår det er optimalt at købe billig strøm til batteriet og sælge den dyrt.</w:t>
+      </w:r>
+    </w:p>
+    <w:p>
+      <w:pPr>
+        <w:pStyle w:val="ListParagraph"/>
+        <w:numPr>
+          <w:ilvl w:val="0"/>
+          <w:numId w:val="1"/>
+        </w:numPr>
+      </w:pPr>
+      <w:r>
+        <w:t>Curtailment er gratis: VE-produktion, der hverken kan bruges, lagres eller eksporteres inden for de øvrige grænser, afskrives uden omkostning.</w:t>
+      </w:r>
+    </w:p>
+    <w:p>
+      <w:r>
+        <w:t xml:space="preserve">VE-løsningens økonomi afhænger stærkt af </w:t>
       </w:r>
       <m:oMath>
         <m:r>
@@ -326,7 +443,7 @@
         </m:r>
       </m:oMath>
       <w:r>
-        <w:t xml:space="preserve">: ved lav </w:t>
+        <w:t xml:space="preserve">. Ved lav </w:t>
       </w:r>
       <m:oMath>
         <m:r>
@@ -337,7 +454,7 @@
         </m:r>
       </m:oMath>
       <w:r>
-        <w:t xml:space="preserve"> er der plads til et massivt overudbud, som sælges på markedet og finansierer systemet; ved høj </w:t>
+        <w:t xml:space="preserve"> er importgrænsen løs, eksportloftet er generøst, og det er optimalt at overudbygge sol og vind markant: overskudsproduktionen sælges på markedet og finansierer en stor del af anlægsomkostningerne. Ved høj </w:t>
       </w:r>
       <m:oMath>
         <m:r>
@@ -348,7 +465,10 @@
         </m:r>
       </m:oMath>
       <w:r>
-        <w:t xml:space="preserve"> kræves en meget større anlægskapacitet, og eksportindtægterne falder relativt til omkostningerne.</w:t>
+        <w:t xml:space="preserve"> strammes kravet time-for-time, eksportloftet falder, og systemet tvinges til selv at dække efterspørgslen i perioder med lav VE-produktion (Dunkelflaute) — det kræver store batterikapaciteter og driver LCOE op</w:t>
+      </w:r>
+      <w:r>
+        <w:t>.</w:t>
       </w:r>
     </w:p>
     <w:p>
@@ -356,6 +476,7 @@
         <w:pStyle w:val="Heading3"/>
       </w:pPr>
       <w:r>
+        <w:lastRenderedPageBreak/>
         <w:t>Antagelser</w:t>
       </w:r>
     </w:p>
@@ -785,29 +906,12 @@
       <w:r>
         <w:t xml:space="preserve"> er DK vægtet gennemsnit, omregnet fra DKK til EUR ved kurs 7,46. </w:t>
       </w:r>
-      <w:proofErr w:type="spellStart"/>
-      <w:r>
-        <w:t>SMR's</w:t>
-      </w:r>
-      <w:proofErr w:type="spellEnd"/>
-      <w:r>
-        <w:t xml:space="preserve"> faste O&amp;M er endnu ikke fastsat af ET og er sat til nul — det undervurderer </w:t>
-      </w:r>
-      <w:proofErr w:type="spellStart"/>
-      <w:r>
-        <w:t>KK's</w:t>
-      </w:r>
-      <w:proofErr w:type="spellEnd"/>
-      <w:r>
-        <w:t xml:space="preserve"> omkostning en smule.</w:t>
-      </w:r>
     </w:p>
     <w:p>
       <w:pPr>
         <w:pStyle w:val="Heading3"/>
       </w:pPr>
       <w:r>
-        <w:lastRenderedPageBreak/>
         <w:t>Resultater</w:t>
       </w:r>
     </w:p>
@@ -855,6 +959,9 @@
         <w:tc>
           <w:tcPr>
             <w:tcW w:w="1925" w:type="dxa"/>
+            <w:tcBorders>
+              <w:bottom w:val="single" w:sz="8" w:space="0" w:color="000000"/>
+            </w:tcBorders>
           </w:tcPr>
           <w:p>
             <w:pPr>
@@ -876,6 +983,9 @@
         <w:tc>
           <w:tcPr>
             <w:tcW w:w="1925" w:type="dxa"/>
+            <w:tcBorders>
+              <w:bottom w:val="single" w:sz="8" w:space="0" w:color="000000"/>
+            </w:tcBorders>
           </w:tcPr>
           <w:p>
             <w:pPr>
@@ -890,13 +1000,27 @@
                 <w:b/>
                 <w:bCs/>
               </w:rPr>
-              <w:t>x</w:t>
-            </w:r>
+              <w:t xml:space="preserve">On-site krav </w:t>
+            </w:r>
+            <m:oMath>
+              <m:r>
+                <m:rPr>
+                  <m:sty m:val="bi"/>
+                </m:rPr>
+                <w:rPr>
+                  <w:rFonts w:ascii="Cambria Math" w:hAnsi="Cambria Math"/>
+                </w:rPr>
+                <m:t>(x)</m:t>
+              </m:r>
+            </m:oMath>
           </w:p>
         </w:tc>
         <w:tc>
           <w:tcPr>
             <w:tcW w:w="1926" w:type="dxa"/>
+            <w:tcBorders>
+              <w:bottom w:val="single" w:sz="8" w:space="0" w:color="000000"/>
+            </w:tcBorders>
           </w:tcPr>
           <w:p>
             <w:pPr>
@@ -918,6 +1042,9 @@
         <w:tc>
           <w:tcPr>
             <w:tcW w:w="1926" w:type="dxa"/>
+            <w:tcBorders>
+              <w:bottom w:val="single" w:sz="8" w:space="0" w:color="000000"/>
+            </w:tcBorders>
           </w:tcPr>
           <w:p>
             <w:pPr>
@@ -939,6 +1066,9 @@
         <w:tc>
           <w:tcPr>
             <w:tcW w:w="1926" w:type="dxa"/>
+            <w:tcBorders>
+              <w:bottom w:val="single" w:sz="8" w:space="0" w:color="000000"/>
+            </w:tcBorders>
           </w:tcPr>
           <w:p>
             <w:pPr>
@@ -963,6 +1093,9 @@
           <w:tcPr>
             <w:tcW w:w="1925" w:type="dxa"/>
             <w:vMerge w:val="restart"/>
+            <w:tcBorders>
+              <w:top w:val="single" w:sz="8" w:space="0" w:color="000000"/>
+            </w:tcBorders>
             <w:vAlign w:val="center"/>
           </w:tcPr>
           <w:p>
@@ -977,6 +1110,9 @@
         <w:tc>
           <w:tcPr>
             <w:tcW w:w="1925" w:type="dxa"/>
+            <w:tcBorders>
+              <w:top w:val="single" w:sz="8" w:space="0" w:color="000000"/>
+            </w:tcBorders>
           </w:tcPr>
           <w:p>
             <w:pPr>
@@ -991,6 +1127,9 @@
           <w:tcPr>
             <w:tcW w:w="1926" w:type="dxa"/>
             <w:vMerge w:val="restart"/>
+            <w:tcBorders>
+              <w:top w:val="single" w:sz="8" w:space="0" w:color="000000"/>
+            </w:tcBorders>
             <w:vAlign w:val="center"/>
           </w:tcPr>
           <w:p>
@@ -1005,6 +1144,9 @@
         <w:tc>
           <w:tcPr>
             <w:tcW w:w="1926" w:type="dxa"/>
+            <w:tcBorders>
+              <w:top w:val="single" w:sz="8" w:space="0" w:color="000000"/>
+            </w:tcBorders>
           </w:tcPr>
           <w:p>
             <w:pPr>
@@ -1018,6 +1160,9 @@
         <w:tc>
           <w:tcPr>
             <w:tcW w:w="1926" w:type="dxa"/>
+            <w:tcBorders>
+              <w:top w:val="single" w:sz="8" w:space="0" w:color="000000"/>
+            </w:tcBorders>
           </w:tcPr>
           <w:p>
             <w:pPr>
@@ -1098,6 +1243,9 @@
           <w:tcPr>
             <w:tcW w:w="1925" w:type="dxa"/>
             <w:vMerge/>
+            <w:tcBorders>
+              <w:bottom w:val="single" w:sz="8" w:space="0" w:color="000000"/>
+            </w:tcBorders>
             <w:vAlign w:val="center"/>
           </w:tcPr>
           <w:p>
@@ -1109,6 +1257,9 @@
         <w:tc>
           <w:tcPr>
             <w:tcW w:w="1925" w:type="dxa"/>
+            <w:tcBorders>
+              <w:bottom w:val="single" w:sz="8" w:space="0" w:color="000000"/>
+            </w:tcBorders>
           </w:tcPr>
           <w:p>
             <w:pPr>
@@ -1133,6 +1284,9 @@
         <w:tc>
           <w:tcPr>
             <w:tcW w:w="1926" w:type="dxa"/>
+            <w:tcBorders>
+              <w:bottom w:val="single" w:sz="8" w:space="0" w:color="000000"/>
+            </w:tcBorders>
           </w:tcPr>
           <w:p>
             <w:pPr>
@@ -1146,6 +1300,9 @@
         <w:tc>
           <w:tcPr>
             <w:tcW w:w="1926" w:type="dxa"/>
+            <w:tcBorders>
+              <w:bottom w:val="single" w:sz="8" w:space="0" w:color="000000"/>
+            </w:tcBorders>
           </w:tcPr>
           <w:p>
             <w:pPr>
@@ -1162,6 +1319,9 @@
           <w:tcPr>
             <w:tcW w:w="1925" w:type="dxa"/>
             <w:vMerge w:val="restart"/>
+            <w:tcBorders>
+              <w:top w:val="single" w:sz="8" w:space="0" w:color="000000"/>
+            </w:tcBorders>
             <w:vAlign w:val="center"/>
           </w:tcPr>
           <w:p>
@@ -1176,6 +1336,9 @@
         <w:tc>
           <w:tcPr>
             <w:tcW w:w="1925" w:type="dxa"/>
+            <w:tcBorders>
+              <w:top w:val="single" w:sz="8" w:space="0" w:color="000000"/>
+            </w:tcBorders>
           </w:tcPr>
           <w:p>
             <w:pPr>
@@ -1200,6 +1363,9 @@
         <w:tc>
           <w:tcPr>
             <w:tcW w:w="1926" w:type="dxa"/>
+            <w:tcBorders>
+              <w:top w:val="single" w:sz="8" w:space="0" w:color="000000"/>
+            </w:tcBorders>
           </w:tcPr>
           <w:p>
             <w:pPr>
@@ -1213,6 +1379,9 @@
         <w:tc>
           <w:tcPr>
             <w:tcW w:w="1926" w:type="dxa"/>
+            <w:tcBorders>
+              <w:top w:val="single" w:sz="8" w:space="0" w:color="000000"/>
+            </w:tcBorders>
           </w:tcPr>
           <w:p>
             <w:pPr>
@@ -1293,6 +1462,9 @@
           <w:tcPr>
             <w:tcW w:w="1925" w:type="dxa"/>
             <w:vMerge/>
+            <w:tcBorders>
+              <w:bottom w:val="single" w:sz="8" w:space="0" w:color="000000"/>
+            </w:tcBorders>
             <w:vAlign w:val="center"/>
           </w:tcPr>
           <w:p>
@@ -1304,6 +1476,9 @@
         <w:tc>
           <w:tcPr>
             <w:tcW w:w="1925" w:type="dxa"/>
+            <w:tcBorders>
+              <w:bottom w:val="single" w:sz="8" w:space="0" w:color="000000"/>
+            </w:tcBorders>
           </w:tcPr>
           <w:p>
             <w:pPr>
@@ -1328,6 +1503,9 @@
         <w:tc>
           <w:tcPr>
             <w:tcW w:w="1926" w:type="dxa"/>
+            <w:tcBorders>
+              <w:bottom w:val="single" w:sz="8" w:space="0" w:color="000000"/>
+            </w:tcBorders>
           </w:tcPr>
           <w:p>
             <w:pPr>
@@ -1341,6 +1519,9 @@
         <w:tc>
           <w:tcPr>
             <w:tcW w:w="1926" w:type="dxa"/>
+            <w:tcBorders>
+              <w:bottom w:val="single" w:sz="8" w:space="0" w:color="000000"/>
+            </w:tcBorders>
           </w:tcPr>
           <w:p>
             <w:pPr>
@@ -1357,6 +1538,9 @@
           <w:tcPr>
             <w:tcW w:w="1925" w:type="dxa"/>
             <w:vMerge w:val="restart"/>
+            <w:tcBorders>
+              <w:top w:val="single" w:sz="8" w:space="0" w:color="000000"/>
+            </w:tcBorders>
             <w:vAlign w:val="center"/>
           </w:tcPr>
           <w:p>
@@ -1371,6 +1555,9 @@
         <w:tc>
           <w:tcPr>
             <w:tcW w:w="1925" w:type="dxa"/>
+            <w:tcBorders>
+              <w:top w:val="single" w:sz="8" w:space="0" w:color="000000"/>
+            </w:tcBorders>
           </w:tcPr>
           <w:p>
             <w:pPr>
@@ -1395,6 +1582,9 @@
         <w:tc>
           <w:tcPr>
             <w:tcW w:w="1926" w:type="dxa"/>
+            <w:tcBorders>
+              <w:top w:val="single" w:sz="8" w:space="0" w:color="000000"/>
+            </w:tcBorders>
           </w:tcPr>
           <w:p>
             <w:pPr>
@@ -1408,6 +1598,9 @@
         <w:tc>
           <w:tcPr>
             <w:tcW w:w="1926" w:type="dxa"/>
+            <w:tcBorders>
+              <w:top w:val="single" w:sz="8" w:space="0" w:color="000000"/>
+            </w:tcBorders>
           </w:tcPr>
           <w:p>
             <w:pPr>
@@ -1488,6 +1681,9 @@
           <w:tcPr>
             <w:tcW w:w="1925" w:type="dxa"/>
             <w:vMerge/>
+            <w:tcBorders>
+              <w:bottom w:val="single" w:sz="8" w:space="0" w:color="000000"/>
+            </w:tcBorders>
             <w:vAlign w:val="center"/>
           </w:tcPr>
           <w:p>
@@ -1499,6 +1695,9 @@
         <w:tc>
           <w:tcPr>
             <w:tcW w:w="1925" w:type="dxa"/>
+            <w:tcBorders>
+              <w:bottom w:val="single" w:sz="8" w:space="0" w:color="000000"/>
+            </w:tcBorders>
           </w:tcPr>
           <w:p>
             <w:pPr>
@@ -1523,6 +1722,9 @@
         <w:tc>
           <w:tcPr>
             <w:tcW w:w="1926" w:type="dxa"/>
+            <w:tcBorders>
+              <w:bottom w:val="single" w:sz="8" w:space="0" w:color="000000"/>
+            </w:tcBorders>
           </w:tcPr>
           <w:p>
             <w:pPr>
@@ -1536,6 +1738,9 @@
         <w:tc>
           <w:tcPr>
             <w:tcW w:w="1926" w:type="dxa"/>
+            <w:tcBorders>
+              <w:bottom w:val="single" w:sz="8" w:space="0" w:color="000000"/>
+            </w:tcBorders>
           </w:tcPr>
           <w:p>
             <w:pPr>
@@ -1552,6 +1757,9 @@
           <w:tcPr>
             <w:tcW w:w="1925" w:type="dxa"/>
             <w:vMerge w:val="restart"/>
+            <w:tcBorders>
+              <w:top w:val="single" w:sz="8" w:space="0" w:color="000000"/>
+            </w:tcBorders>
             <w:vAlign w:val="center"/>
           </w:tcPr>
           <w:p>
@@ -1571,6 +1779,9 @@
         <w:tc>
           <w:tcPr>
             <w:tcW w:w="1925" w:type="dxa"/>
+            <w:tcBorders>
+              <w:top w:val="single" w:sz="8" w:space="0" w:color="000000"/>
+            </w:tcBorders>
           </w:tcPr>
           <w:p>
             <w:pPr>
@@ -1595,6 +1806,9 @@
         <w:tc>
           <w:tcPr>
             <w:tcW w:w="1926" w:type="dxa"/>
+            <w:tcBorders>
+              <w:top w:val="single" w:sz="8" w:space="0" w:color="000000"/>
+            </w:tcBorders>
           </w:tcPr>
           <w:p>
             <w:pPr>
@@ -1608,6 +1822,9 @@
         <w:tc>
           <w:tcPr>
             <w:tcW w:w="1926" w:type="dxa"/>
+            <w:tcBorders>
+              <w:top w:val="single" w:sz="8" w:space="0" w:color="000000"/>
+            </w:tcBorders>
           </w:tcPr>
           <w:p>
             <w:pPr>
@@ -1683,12 +1900,18 @@
           <w:tcPr>
             <w:tcW w:w="1925" w:type="dxa"/>
             <w:vMerge/>
+            <w:tcBorders>
+              <w:bottom w:val="single" w:sz="8" w:space="0" w:color="000000"/>
+            </w:tcBorders>
           </w:tcPr>
           <w:p/>
         </w:tc>
         <w:tc>
           <w:tcPr>
             <w:tcW w:w="1925" w:type="dxa"/>
+            <w:tcBorders>
+              <w:bottom w:val="single" w:sz="8" w:space="0" w:color="000000"/>
+            </w:tcBorders>
           </w:tcPr>
           <w:p>
             <w:pPr>
@@ -1703,6 +1926,9 @@
           <w:tcPr>
             <w:tcW w:w="1926" w:type="dxa"/>
             <w:vMerge/>
+            <w:tcBorders>
+              <w:bottom w:val="single" w:sz="8" w:space="0" w:color="000000"/>
+            </w:tcBorders>
           </w:tcPr>
           <w:p>
             <w:pPr>
@@ -1713,6 +1939,9 @@
         <w:tc>
           <w:tcPr>
             <w:tcW w:w="1926" w:type="dxa"/>
+            <w:tcBorders>
+              <w:bottom w:val="single" w:sz="8" w:space="0" w:color="000000"/>
+            </w:tcBorders>
           </w:tcPr>
           <w:p>
             <w:pPr>
@@ -1726,6 +1955,9 @@
         <w:tc>
           <w:tcPr>
             <w:tcW w:w="1926" w:type="dxa"/>
+            <w:tcBorders>
+              <w:bottom w:val="single" w:sz="8" w:space="0" w:color="000000"/>
+            </w:tcBorders>
           </w:tcPr>
           <w:p>
             <w:pPr>
@@ -1739,6 +1971,644 @@
       </w:tr>
     </w:tbl>
     <w:p/>
+    <w:p>
+      <w:pPr>
+        <w:pStyle w:val="Heading4"/>
+      </w:pPr>
+      <w:r>
+        <w:t>Kapacitetsvalg i hovedscenariet (x = 50 %, 2025)</w:t>
+      </w:r>
+    </w:p>
+    <w:p>
+      <w:r>
+        <w:t xml:space="preserve">Under optimale betingelser dimensionerer </w:t>
+      </w:r>
+      <w:r>
+        <w:t>operatøren</w:t>
+      </w:r>
+      <w:r>
+        <w:t xml:space="preserve"> </w:t>
+      </w:r>
+      <w:r>
+        <w:t>de følgende VE-</w:t>
+      </w:r>
+      <w:r>
+        <w:t>anlæg</w:t>
+      </w:r>
+      <w:r>
+        <w:t xml:space="preserve"> (husk at kernekraftanlægget altid er ens)</w:t>
+      </w:r>
+      <w:r>
+        <w:t>:</w:t>
+      </w:r>
+      <w:r>
+        <w:t xml:space="preserve"> </w:t>
+      </w:r>
+    </w:p>
+    <w:tbl>
+      <w:tblPr>
+        <w:tblStyle w:val="TableGrid"/>
+        <w:tblW w:w="9649" w:type="dxa"/>
+        <w:tblLook w:val="04A0" w:firstRow="1" w:lastRow="0" w:firstColumn="1" w:lastColumn="0" w:noHBand="0" w:noVBand="1"/>
+      </w:tblPr>
+      <w:tblGrid>
+        <w:gridCol w:w="1574"/>
+        <w:gridCol w:w="1756"/>
+        <w:gridCol w:w="1931"/>
+        <w:gridCol w:w="2106"/>
+        <w:gridCol w:w="2282"/>
+      </w:tblGrid>
+      <w:tr>
+        <w:trPr>
+          <w:trHeight w:val="247"/>
+        </w:trPr>
+        <w:tc>
+          <w:tcPr>
+            <w:tcW w:w="1574" w:type="dxa"/>
+          </w:tcPr>
+          <w:p>
+            <w:pPr>
+              <w:rPr>
+                <w:b/>
+                <w:bCs/>
+              </w:rPr>
+            </w:pPr>
+          </w:p>
+        </w:tc>
+        <w:tc>
+          <w:tcPr>
+            <w:tcW w:w="1756" w:type="dxa"/>
+          </w:tcPr>
+          <w:p>
+            <w:pPr>
+              <w:rPr>
+                <w:b/>
+                <w:bCs/>
+              </w:rPr>
+            </w:pPr>
+            <w:r>
+              <w:rPr>
+                <w:b/>
+                <w:bCs/>
+              </w:rPr>
+              <w:t>Sol</w:t>
+            </w:r>
+          </w:p>
+        </w:tc>
+        <w:tc>
+          <w:tcPr>
+            <w:tcW w:w="1931" w:type="dxa"/>
+          </w:tcPr>
+          <w:p>
+            <w:pPr>
+              <w:rPr>
+                <w:b/>
+                <w:bCs/>
+              </w:rPr>
+            </w:pPr>
+            <w:r>
+              <w:rPr>
+                <w:b/>
+                <w:bCs/>
+              </w:rPr>
+              <w:t>Vind</w:t>
+            </w:r>
+          </w:p>
+        </w:tc>
+        <w:tc>
+          <w:tcPr>
+            <w:tcW w:w="2106" w:type="dxa"/>
+          </w:tcPr>
+          <w:p>
+            <w:pPr>
+              <w:rPr>
+                <w:b/>
+                <w:bCs/>
+              </w:rPr>
+            </w:pPr>
+            <w:r>
+              <w:rPr>
+                <w:b/>
+                <w:bCs/>
+              </w:rPr>
+              <w:t>Batteri (effekt)</w:t>
+            </w:r>
+          </w:p>
+        </w:tc>
+        <w:tc>
+          <w:tcPr>
+            <w:tcW w:w="2282" w:type="dxa"/>
+          </w:tcPr>
+          <w:p>
+            <w:pPr>
+              <w:rPr>
+                <w:b/>
+                <w:bCs/>
+              </w:rPr>
+            </w:pPr>
+            <w:r>
+              <w:rPr>
+                <w:b/>
+                <w:bCs/>
+              </w:rPr>
+              <w:t>Batteri (energi)</w:t>
+            </w:r>
+          </w:p>
+        </w:tc>
+      </w:tr>
+      <w:tr>
+        <w:trPr>
+          <w:trHeight w:val="247"/>
+        </w:trPr>
+        <w:tc>
+          <w:tcPr>
+            <w:tcW w:w="1574" w:type="dxa"/>
+          </w:tcPr>
+          <w:p>
+            <w:pPr>
+              <w:rPr>
+                <w:b/>
+                <w:bCs/>
+              </w:rPr>
+            </w:pPr>
+            <w:r>
+              <w:rPr>
+                <w:b/>
+                <w:bCs/>
+              </w:rPr>
+              <w:t>Kapacitet</w:t>
+            </w:r>
+          </w:p>
+        </w:tc>
+        <w:tc>
+          <w:tcPr>
+            <w:tcW w:w="1756" w:type="dxa"/>
+          </w:tcPr>
+          <w:p>
+            <w:pPr>
+              <w:jc w:val="right"/>
+            </w:pPr>
+            <w:r>
+              <w:t>6.564 MW</w:t>
+            </w:r>
+          </w:p>
+        </w:tc>
+        <w:tc>
+          <w:tcPr>
+            <w:tcW w:w="1931" w:type="dxa"/>
+          </w:tcPr>
+          <w:p>
+            <w:pPr>
+              <w:jc w:val="right"/>
+            </w:pPr>
+            <w:r>
+              <w:t>3.106 MW</w:t>
+            </w:r>
+          </w:p>
+        </w:tc>
+        <w:tc>
+          <w:tcPr>
+            <w:tcW w:w="2106" w:type="dxa"/>
+          </w:tcPr>
+          <w:p>
+            <w:pPr>
+              <w:jc w:val="right"/>
+            </w:pPr>
+            <w:r>
+              <w:t>7.109 MW</w:t>
+            </w:r>
+          </w:p>
+        </w:tc>
+        <w:tc>
+          <w:tcPr>
+            <w:tcW w:w="2282" w:type="dxa"/>
+          </w:tcPr>
+          <w:p>
+            <w:pPr>
+              <w:jc w:val="right"/>
+            </w:pPr>
+            <w:r>
+              <w:t>28.437 MWh (4t)</w:t>
+            </w:r>
+          </w:p>
+        </w:tc>
+      </w:tr>
+    </w:tbl>
+    <w:p/>
+    <w:p>
+      <w:r>
+        <w:t xml:space="preserve">Solkapaciteten på </w:t>
+      </w:r>
+      <m:oMath>
+        <m:r>
+          <w:rPr>
+            <w:rFonts w:ascii="Cambria Math" w:hAnsi="Cambria Math"/>
+          </w:rPr>
+          <m:t>6.564 MW</m:t>
+        </m:r>
+      </m:oMath>
+      <w:r>
+        <w:t xml:space="preserve"> er 6,6 gange datacentrets forbrug — en markant overbygning, der er rationel netop fordi eksport er tilladt op til </w:t>
+      </w:r>
+      <m:oMath>
+        <m:r>
+          <w:rPr>
+            <w:rFonts w:ascii="Cambria Math" w:hAnsi="Cambria Math"/>
+          </w:rPr>
+          <m:t>500 MW</m:t>
+        </m:r>
+      </m:oMath>
+      <w:r>
+        <w:t xml:space="preserve"> pr. time: overskudsproduktionen i soltimer finansierer en del af anlægsomkostningerne via salgsprisen. Vindkapaciteten på </w:t>
+      </w:r>
+      <m:oMath>
+        <m:r>
+          <w:rPr>
+            <w:rFonts w:ascii="Cambria Math" w:hAnsi="Cambria Math"/>
+          </w:rPr>
+          <m:t>3.106 MW</m:t>
+        </m:r>
+      </m:oMath>
+      <w:r>
+        <w:t xml:space="preserve"> dækker primært vinterperiodens behov. Batteriets store effektkapacitet (</w:t>
+      </w:r>
+      <m:oMath>
+        <m:r>
+          <w:rPr>
+            <w:rFonts w:ascii="Cambria Math" w:hAnsi="Cambria Math"/>
+          </w:rPr>
+          <m:t>7.109 MW</m:t>
+        </m:r>
+      </m:oMath>
+      <w:r>
+        <w:t xml:space="preserve">) tjener to formål simultant: det udjævner timevariation i </w:t>
+      </w:r>
+      <w:r>
+        <w:lastRenderedPageBreak/>
+        <w:t>VE-produktionen og optjener prisarbitrageindtægter ved at oplade i negative eller lave pristimer og aflade i dyre timer.</w:t>
+      </w:r>
+    </w:p>
+    <w:p>
+      <w:r>
+        <w:t xml:space="preserve">Den samlede nettoomkostning på </w:t>
+      </w:r>
+      <m:oMath>
+        <m:r>
+          <w:rPr>
+            <w:rFonts w:ascii="Cambria Math" w:hAnsi="Cambria Math"/>
+          </w:rPr>
+          <m:t>817,9 M€/år</m:t>
+        </m:r>
+      </m:oMath>
+      <w:r>
+        <w:t xml:space="preserve"> fremkommer som summen af anlægsinvesteringer, nettokøb og eksportsalg:</w:t>
+      </w:r>
+    </w:p>
+    <w:tbl>
+      <w:tblPr>
+        <w:tblStyle w:val="TableGrid"/>
+        <w:tblW w:w="0" w:type="auto"/>
+        <w:tblLook w:val="04A0" w:firstRow="1" w:lastRow="0" w:firstColumn="1" w:lastColumn="0" w:noHBand="0" w:noVBand="1"/>
+      </w:tblPr>
+      <w:tblGrid>
+        <w:gridCol w:w="1375"/>
+        <w:gridCol w:w="1375"/>
+        <w:gridCol w:w="1375"/>
+        <w:gridCol w:w="1375"/>
+        <w:gridCol w:w="1376"/>
+        <w:gridCol w:w="1376"/>
+        <w:gridCol w:w="1376"/>
+      </w:tblGrid>
+      <w:tr>
+        <w:tc>
+          <w:tcPr>
+            <w:tcW w:w="1375" w:type="dxa"/>
+          </w:tcPr>
+          <w:p>
+            <w:pPr>
+              <w:rPr>
+                <w:b/>
+                <w:bCs/>
+              </w:rPr>
+            </w:pPr>
+          </w:p>
+        </w:tc>
+        <w:tc>
+          <w:tcPr>
+            <w:tcW w:w="1375" w:type="dxa"/>
+          </w:tcPr>
+          <w:p>
+            <w:pPr>
+              <w:rPr>
+                <w:b/>
+                <w:bCs/>
+              </w:rPr>
+            </w:pPr>
+            <w:r>
+              <w:rPr>
+                <w:b/>
+                <w:bCs/>
+              </w:rPr>
+              <w:t>Sol</w:t>
+            </w:r>
+          </w:p>
+        </w:tc>
+        <w:tc>
+          <w:tcPr>
+            <w:tcW w:w="1375" w:type="dxa"/>
+          </w:tcPr>
+          <w:p>
+            <w:pPr>
+              <w:rPr>
+                <w:b/>
+                <w:bCs/>
+              </w:rPr>
+            </w:pPr>
+            <w:r>
+              <w:rPr>
+                <w:b/>
+                <w:bCs/>
+              </w:rPr>
+              <w:t>Vind</w:t>
+            </w:r>
+          </w:p>
+        </w:tc>
+        <w:tc>
+          <w:tcPr>
+            <w:tcW w:w="1375" w:type="dxa"/>
+          </w:tcPr>
+          <w:p>
+            <w:pPr>
+              <w:rPr>
+                <w:b/>
+                <w:bCs/>
+              </w:rPr>
+            </w:pPr>
+            <w:r>
+              <w:rPr>
+                <w:b/>
+                <w:bCs/>
+              </w:rPr>
+              <w:t>Batteri</w:t>
+            </w:r>
+          </w:p>
+        </w:tc>
+        <w:tc>
+          <w:tcPr>
+            <w:tcW w:w="1376" w:type="dxa"/>
+          </w:tcPr>
+          <w:p>
+            <w:pPr>
+              <w:rPr>
+                <w:b/>
+                <w:bCs/>
+              </w:rPr>
+            </w:pPr>
+            <w:proofErr w:type="spellStart"/>
+            <w:r>
+              <w:rPr>
+                <w:b/>
+                <w:bCs/>
+              </w:rPr>
+              <w:t>Inv</w:t>
+            </w:r>
+            <w:proofErr w:type="spellEnd"/>
+            <w:r>
+              <w:rPr>
+                <w:b/>
+                <w:bCs/>
+              </w:rPr>
+              <w:t>. i alt</w:t>
+            </w:r>
+          </w:p>
+        </w:tc>
+        <w:tc>
+          <w:tcPr>
+            <w:tcW w:w="1376" w:type="dxa"/>
+          </w:tcPr>
+          <w:p>
+            <w:pPr>
+              <w:rPr>
+                <w:b/>
+                <w:bCs/>
+              </w:rPr>
+            </w:pPr>
+            <w:r>
+              <w:rPr>
+                <w:b/>
+                <w:bCs/>
+              </w:rPr>
+              <w:t>+ Nettokøb</w:t>
+            </w:r>
+          </w:p>
+        </w:tc>
+        <w:tc>
+          <w:tcPr>
+            <w:tcW w:w="1376" w:type="dxa"/>
+          </w:tcPr>
+          <w:p>
+            <w:pPr>
+              <w:rPr>
+                <w:b/>
+                <w:bCs/>
+              </w:rPr>
+            </w:pPr>
+            <w:r>
+              <w:rPr>
+                <w:b/>
+                <w:bCs/>
+              </w:rPr>
+              <w:t>− Eksport</w:t>
+            </w:r>
+          </w:p>
+        </w:tc>
+      </w:tr>
+      <w:tr>
+        <w:tc>
+          <w:tcPr>
+            <w:tcW w:w="1375" w:type="dxa"/>
+          </w:tcPr>
+          <w:p>
+            <w:pPr>
+              <w:rPr>
+                <w:b/>
+                <w:bCs/>
+              </w:rPr>
+            </w:pPr>
+            <w:r>
+              <w:rPr>
+                <w:b/>
+                <w:bCs/>
+              </w:rPr>
+              <w:t>M€/år</w:t>
+            </w:r>
+          </w:p>
+        </w:tc>
+        <w:tc>
+          <w:tcPr>
+            <w:tcW w:w="1375" w:type="dxa"/>
+          </w:tcPr>
+          <w:p>
+            <w:pPr>
+              <w:jc w:val="right"/>
+            </w:pPr>
+            <w:r>
+              <w:t>217,5</w:t>
+            </w:r>
+          </w:p>
+        </w:tc>
+        <w:tc>
+          <w:tcPr>
+            <w:tcW w:w="1375" w:type="dxa"/>
+          </w:tcPr>
+          <w:p>
+            <w:pPr>
+              <w:jc w:val="right"/>
+            </w:pPr>
+            <w:r>
+              <w:t>270,5</w:t>
+            </w:r>
+          </w:p>
+        </w:tc>
+        <w:tc>
+          <w:tcPr>
+            <w:tcW w:w="1375" w:type="dxa"/>
+          </w:tcPr>
+          <w:p>
+            <w:pPr>
+              <w:jc w:val="right"/>
+            </w:pPr>
+            <w:r>
+              <w:t>518,0</w:t>
+            </w:r>
+          </w:p>
+        </w:tc>
+        <w:tc>
+          <w:tcPr>
+            <w:tcW w:w="1376" w:type="dxa"/>
+          </w:tcPr>
+          <w:p>
+            <w:pPr>
+              <w:jc w:val="right"/>
+            </w:pPr>
+            <w:r>
+              <w:t>1.006,1</w:t>
+            </w:r>
+          </w:p>
+        </w:tc>
+        <w:tc>
+          <w:tcPr>
+            <w:tcW w:w="1376" w:type="dxa"/>
+          </w:tcPr>
+          <w:p>
+            <w:pPr>
+              <w:jc w:val="right"/>
+            </w:pPr>
+            <w:r>
+              <w:t>+84,3</w:t>
+            </w:r>
+          </w:p>
+        </w:tc>
+        <w:tc>
+          <w:tcPr>
+            <w:tcW w:w="1376" w:type="dxa"/>
+          </w:tcPr>
+          <w:p>
+            <w:pPr>
+              <w:jc w:val="right"/>
+            </w:pPr>
+            <w:r>
+              <w:t>−272,6</w:t>
+            </w:r>
+          </w:p>
+        </w:tc>
+      </w:tr>
+    </w:tbl>
+    <w:p/>
+    <w:p>
+      <w:pPr>
+        <w:rPr>
+          <w:rFonts w:eastAsiaTheme="minorEastAsia"/>
+        </w:rPr>
+      </w:pPr>
+      <w:r>
+        <w:t xml:space="preserve">Batteriet tegner sig alene for </w:t>
+      </w:r>
+      <m:oMath>
+        <m:r>
+          <w:rPr>
+            <w:rFonts w:ascii="Cambria Math" w:hAnsi="Cambria Math"/>
+          </w:rPr>
+          <m:t xml:space="preserve">51 </m:t>
+        </m:r>
+      </m:oMath>
+      <w:r>
+        <w:t xml:space="preserve"> af investeringsomkostningerne, primært drevet af energikomponenten (</w:t>
+      </w:r>
+      <m:oMath>
+        <m:r>
+          <w:rPr>
+            <w:rFonts w:ascii="Cambria Math" w:hAnsi="Cambria Math"/>
+          </w:rPr>
+          <m:t xml:space="preserve">28.437 MWh </m:t>
+        </m:r>
+        <m:r>
+          <m:rPr>
+            <m:sty m:val="p"/>
+          </m:rPr>
+          <w:rPr>
+            <w:rFonts w:ascii="Cambria Math" w:hAnsi="Cambria Math"/>
+          </w:rPr>
+          <m:t>⋅</m:t>
+        </m:r>
+        <m:r>
+          <w:rPr>
+            <w:rFonts w:ascii="Cambria Math" w:hAnsi="Cambria Math"/>
+          </w:rPr>
+          <m:t>200 €</m:t>
+        </m:r>
+        <m:r>
+          <m:rPr>
+            <m:lit/>
+          </m:rPr>
+          <w:rPr>
+            <w:rFonts w:ascii="Cambria Math" w:hAnsi="Cambria Math"/>
+          </w:rPr>
+          <m:t>/</m:t>
+        </m:r>
+        <m:r>
+          <w:rPr>
+            <w:rFonts w:ascii="Cambria Math" w:hAnsi="Cambria Math"/>
+          </w:rPr>
+          <m:t>kWh</m:t>
+        </m:r>
+      </m:oMath>
+      <w:r>
+        <w:t xml:space="preserve"> annualiseret). Eksportsalget på </w:t>
+      </w:r>
+      <m:oMath>
+        <m:r>
+          <w:rPr>
+            <w:rFonts w:ascii="Cambria Math" w:hAnsi="Cambria Math"/>
+          </w:rPr>
+          <m:t>272,6 M€/år</m:t>
+        </m:r>
+      </m:oMath>
+      <w:r>
+        <w:t xml:space="preserve"> svarer til en reduktion i de totale omkostninger på ca. </w:t>
+      </w:r>
+      <m:oMath>
+        <m:r>
+          <w:rPr>
+            <w:rFonts w:ascii="Cambria Math" w:hAnsi="Cambria Math"/>
+          </w:rPr>
+          <m:t>27 %</m:t>
+        </m:r>
+      </m:oMath>
+      <w:r>
+        <w:t xml:space="preserve"> og er den vigtigste enkeltpost til at finansiere den store sol- og vindoverbygning. Nettokøb fra nettet udgør en relativt beskeden post, da systemet er dimensioneret til at dække næsten al efterspørgsel on-site.</w:t>
+      </w:r>
+    </w:p>
     <w:p>
       <w:pPr>
         <w:pStyle w:val="Heading4"/>
@@ -1855,7 +2725,7 @@
     <w:p>
       <w:r>
         <w:drawing>
-          <wp:inline distT="0" distB="0" distL="0" distR="0" wp14:anchorId="632DD04A" wp14:editId="0D9A811F">
+          <wp:inline distT="0" distB="0" distL="0" distR="0" wp14:anchorId="1CE537D9" wp14:editId="2D883513">
             <wp:extent cx="6120130" cy="2990850"/>
             <wp:effectExtent l="0" t="0" r="0" b="0"/>
             <wp:docPr id="2106429756" name="Picture 1"/>
@@ -1870,7 +2740,7 @@
                     <pic:cNvPicPr/>
                   </pic:nvPicPr>
                   <pic:blipFill>
-                    <a:blip r:embed="rId4"/>
+                    <a:blip r:embed="rId5"/>
                     <a:stretch>
                       <a:fillRect/>
                     </a:stretch>
@@ -1896,7 +2766,6 @@
         <w:pStyle w:val="Heading4"/>
       </w:pPr>
       <w:r>
-        <w:lastRenderedPageBreak/>
         <w:t xml:space="preserve">Figur 2 — Batteritilstand og flowmønster (x = </w:t>
       </w:r>
       <w:r>
@@ -1922,29 +2791,28 @@
         <w:t>15</w:t>
       </w:r>
       <w:r>
-        <w:t xml:space="preserve"> GWh, med de højeste niveauer i januar og i sommermånederne. Opladet effekt (lyserød) har spidser op mod 600–700 MW; det sker navnlig om sommeren, når soloverflod kombineres med høje priser. Afladning til datacentret (rød kurve) er betydelig og ujævn; afladning til nettet (sort) er mere stabil og afspejler prisarbitrage. Mønsteret illustrerer, at batteriet udfylder to roller: det sikrer </w:t>
-      </w:r>
-      <w:proofErr w:type="spellStart"/>
-      <w:r>
-        <w:t>forsyningssikkerhed</w:t>
-      </w:r>
-      <w:proofErr w:type="spellEnd"/>
-      <w:r>
-        <w:t xml:space="preserve"> ved </w:t>
-      </w:r>
-      <w:proofErr w:type="spellStart"/>
-      <w:r>
-        <w:t>Dunkelflaute</w:t>
-      </w:r>
-      <w:proofErr w:type="spellEnd"/>
-      <w:r>
-        <w:t xml:space="preserve"> og optjener arbitrageindtægter ved at flytte energi til dyre timer.</w:t>
+        <w:t xml:space="preserve"> GWh, med de højeste niveauer i januar og i sommermånederne. Opladet effekt (lyserød) har spidser op mod </w:t>
+      </w:r>
+      <m:oMath>
+        <m:r>
+          <w:rPr>
+            <w:rFonts w:ascii="Cambria Math" w:hAnsi="Cambria Math"/>
+          </w:rPr>
+          <m:t>600-700 MW</m:t>
+        </m:r>
+      </m:oMath>
+      <w:r>
+        <w:t xml:space="preserve">; det sker navnlig om sommeren, når </w:t>
+      </w:r>
+      <w:r>
+        <w:lastRenderedPageBreak/>
+        <w:t>soloverflod kombineres med høje priser. Afladning til datacentret (rød kurve) er betydelig og ujævn; afladning til nettet (sort) er mere stabil og afspejler prisarbitrage. Mønsteret illustrerer, at batteriet udfylder to roller: det sikrer forsyningssikkerhed ved Dunkelflaute og optjener arbitrageindtægter ved at flytte energi til dyre timer.</w:t>
       </w:r>
     </w:p>
     <w:p>
       <w:r>
         <w:drawing>
-          <wp:inline distT="0" distB="0" distL="0" distR="0" wp14:anchorId="3CA6DC98" wp14:editId="561BD535">
+          <wp:inline distT="0" distB="0" distL="0" distR="0" wp14:anchorId="4CBDA181" wp14:editId="4F765684">
             <wp:extent cx="6120130" cy="2983865"/>
             <wp:effectExtent l="0" t="0" r="0" b="6985"/>
             <wp:docPr id="228028765" name="Picture 1"/>
@@ -1959,7 +2827,7 @@
                     <pic:cNvPicPr/>
                   </pic:nvPicPr>
                   <pic:blipFill>
-                    <a:blip r:embed="rId5"/>
+                    <a:blip r:embed="rId6"/>
                     <a:stretch>
                       <a:fillRect/>
                     </a:stretch>
@@ -2034,6 +2902,103 @@
     </w:sectPr>
   </w:body>
 </w:document>
+</file>
+
+<file path=word/numbering.xml><?xml version="1.0" encoding="utf-8"?>
+<w:numbering xmlns:wpc="http://schemas.microsoft.com/office/word/2010/wordprocessingCanvas" xmlns:cx="http://schemas.microsoft.com/office/drawing/2014/chartex" xmlns:cx1="http://schemas.microsoft.com/office/drawing/2015/9/8/chartex" xmlns:cx2="http://schemas.microsoft.com/office/drawing/2015/10/21/chartex" xmlns:cx3="http://schemas.microsoft.com/office/drawing/2016/5/9/chartex" xmlns:cx4="http://schemas.microsoft.com/office/drawing/2016/5/10/chartex" xmlns:cx5="http://schemas.microsoft.com/office/drawing/2016/5/11/chartex" xmlns:cx6="http://schemas.microsoft.com/office/drawing/2016/5/12/chartex" xmlns:cx7="http://schemas.microsoft.com/office/drawing/2016/5/13/chartex" xmlns:cx8="http://schemas.microsoft.com/office/drawing/2016/5/14/chartex" xmlns:mc="http://schemas.openxmlformats.org/markup-compatibility/2006" xmlns:aink="http://schemas.microsoft.com/office/drawing/2016/ink" xmlns:am3d="http://schemas.microsoft.com/office/drawing/2017/model3d" xmlns:o="urn:schemas-microsoft-com:office:office" xmlns:oel="http://schemas.microsoft.com/office/2019/extlst" xmlns:r="http://schemas.openxmlformats.org/officeDocument/2006/relationships" xmlns:m="http://schemas.openxmlformats.org/officeDocument/2006/math" xmlns:v="urn:schemas-microsoft-com:vml" xmlns:wp14="http://schemas.microsoft.com/office/word/2010/wordprocessingDrawing" xmlns:wp="http://schemas.openxmlformats.org/drawingml/2006/wordprocessingDrawing" xmlns:w10="urn:schemas-microsoft-com:office:word" xmlns:w="http://schemas.openxmlformats.org/wordprocessingml/2006/main" xmlns:w14="http://schemas.microsoft.com/office/word/2010/wordml" xmlns:w15="http://schemas.microsoft.com/office/word/2012/wordml" xmlns:w16cex="http://schemas.microsoft.com/office/word/2018/wordml/cex" xmlns:w16cid="http://schemas.microsoft.com/office/word/2016/wordml/cid" xmlns:w16="http://schemas.microsoft.com/office/word/2018/wordml" xmlns:w16du="http://schemas.microsoft.com/office/word/2023/wordml/word16du" xmlns:w16sdtdh="http://schemas.microsoft.com/office/word/2020/wordml/sdtdatahash" xmlns:w16sdtfl="http://schemas.microsoft.com/office/word/2024/wordml/sdtformatlock" xmlns:w16se="http://schemas.microsoft.com/office/word/2015/wordml/symex" xmlns:wpg="http://schemas.microsoft.com/office/word/2010/wordprocessingGroup" xmlns:wpi="http://schemas.microsoft.com/office/word/2010/wordprocessingInk" xmlns:wne="http://schemas.microsoft.com/office/word/2006/wordml" xmlns:wps="http://schemas.microsoft.com/office/word/2010/wordprocessingShape" mc:Ignorable="w14 w15 w16se w16cid w16 w16cex w16sdtdh w16sdtfl w16du wp14">
+  <w:abstractNum w:abstractNumId="0" w15:restartNumberingAfterBreak="0">
+    <w:nsid w:val="78965321"/>
+    <w:multiLevelType w:val="hybridMultilevel"/>
+    <w:tmpl w:val="CAFCB8A4"/>
+    <w:lvl w:ilvl="0" w:tplc="0406000F">
+      <w:start w:val="1"/>
+      <w:numFmt w:val="decimal"/>
+      <w:lvlText w:val="%1."/>
+      <w:lvlJc w:val="left"/>
+      <w:pPr>
+        <w:ind w:left="720" w:hanging="360"/>
+      </w:pPr>
+      <w:rPr>
+        <w:rFonts w:hint="default"/>
+      </w:rPr>
+    </w:lvl>
+    <w:lvl w:ilvl="1" w:tplc="04060019" w:tentative="1">
+      <w:start w:val="1"/>
+      <w:numFmt w:val="lowerLetter"/>
+      <w:lvlText w:val="%2."/>
+      <w:lvlJc w:val="left"/>
+      <w:pPr>
+        <w:ind w:left="1440" w:hanging="360"/>
+      </w:pPr>
+    </w:lvl>
+    <w:lvl w:ilvl="2" w:tplc="0406001B" w:tentative="1">
+      <w:start w:val="1"/>
+      <w:numFmt w:val="lowerRoman"/>
+      <w:lvlText w:val="%3."/>
+      <w:lvlJc w:val="right"/>
+      <w:pPr>
+        <w:ind w:left="2160" w:hanging="180"/>
+      </w:pPr>
+    </w:lvl>
+    <w:lvl w:ilvl="3" w:tplc="0406000F" w:tentative="1">
+      <w:start w:val="1"/>
+      <w:numFmt w:val="decimal"/>
+      <w:lvlText w:val="%4."/>
+      <w:lvlJc w:val="left"/>
+      <w:pPr>
+        <w:ind w:left="2880" w:hanging="360"/>
+      </w:pPr>
+    </w:lvl>
+    <w:lvl w:ilvl="4" w:tplc="04060019" w:tentative="1">
+      <w:start w:val="1"/>
+      <w:numFmt w:val="lowerLetter"/>
+      <w:lvlText w:val="%5."/>
+      <w:lvlJc w:val="left"/>
+      <w:pPr>
+        <w:ind w:left="3600" w:hanging="360"/>
+      </w:pPr>
+    </w:lvl>
+    <w:lvl w:ilvl="5" w:tplc="0406001B" w:tentative="1">
+      <w:start w:val="1"/>
+      <w:numFmt w:val="lowerRoman"/>
+      <w:lvlText w:val="%6."/>
+      <w:lvlJc w:val="right"/>
+      <w:pPr>
+        <w:ind w:left="4320" w:hanging="180"/>
+      </w:pPr>
+    </w:lvl>
+    <w:lvl w:ilvl="6" w:tplc="0406000F" w:tentative="1">
+      <w:start w:val="1"/>
+      <w:numFmt w:val="decimal"/>
+      <w:lvlText w:val="%7."/>
+      <w:lvlJc w:val="left"/>
+      <w:pPr>
+        <w:ind w:left="5040" w:hanging="360"/>
+      </w:pPr>
+    </w:lvl>
+    <w:lvl w:ilvl="7" w:tplc="04060019" w:tentative="1">
+      <w:start w:val="1"/>
+      <w:numFmt w:val="lowerLetter"/>
+      <w:lvlText w:val="%8."/>
+      <w:lvlJc w:val="left"/>
+      <w:pPr>
+        <w:ind w:left="5760" w:hanging="360"/>
+      </w:pPr>
+    </w:lvl>
+    <w:lvl w:ilvl="8" w:tplc="0406001B" w:tentative="1">
+      <w:start w:val="1"/>
+      <w:numFmt w:val="lowerRoman"/>
+      <w:lvlText w:val="%9."/>
+      <w:lvlJc w:val="right"/>
+      <w:pPr>
+        <w:ind w:left="6480" w:hanging="180"/>
+      </w:pPr>
+    </w:lvl>
+  </w:abstractNum>
+  <w:num w:numId="1" w16cid:durableId="1577518923">
+    <w:abstractNumId w:val="0"/>
+  </w:num>
+</w:numbering>
 </file>
 
 <file path=word/styles.xml><?xml version="1.0" encoding="utf-8"?>
@@ -3282,4 +4247,249 @@
     </a:ext>
   </a:extLst>
 </a:theme>
+</file>
+
+<file path=customXml/item1.xml><?xml version="1.0" encoding="utf-8"?>
+<ct:contentTypeSchema xmlns:ct="http://schemas.microsoft.com/office/2006/metadata/contentType" xmlns:ma="http://schemas.microsoft.com/office/2006/metadata/properties/metaAttributes" ct:_="" ma:_="" ma:contentTypeName="Dokument" ma:contentTypeID="0x0101003E1D8F13C92F2D4AA551A876B7C6A7A3" ma:contentTypeVersion="14" ma:contentTypeDescription="Opret et nyt dokument." ma:contentTypeScope="" ma:versionID="d37aed14d94f33d2da64e931d0bd0598">
+  <xsd:schema xmlns:xsd="http://www.w3.org/2001/XMLSchema" xmlns:xs="http://www.w3.org/2001/XMLSchema" xmlns:p="http://schemas.microsoft.com/office/2006/metadata/properties" xmlns:ns2="53694279-be3b-48f4-abf1-f846896aa128" xmlns:ns3="fb2e3c1a-d678-4045-ab86-cec8bd5b223c" targetNamespace="http://schemas.microsoft.com/office/2006/metadata/properties" ma:root="true" ma:fieldsID="457325b8327431c556ce0cceb7774680" ns2:_="" ns3:_="">
+    <xsd:import namespace="53694279-be3b-48f4-abf1-f846896aa128"/>
+    <xsd:import namespace="fb2e3c1a-d678-4045-ab86-cec8bd5b223c"/>
+    <xsd:element name="properties">
+      <xsd:complexType>
+        <xsd:sequence>
+          <xsd:element name="documentManagement">
+            <xsd:complexType>
+              <xsd:all>
+                <xsd:element ref="ns2:MediaServiceMetadata" minOccurs="0"/>
+                <xsd:element ref="ns2:MediaServiceFastMetadata" minOccurs="0"/>
+                <xsd:element ref="ns2:MediaServiceSearchProperties" minOccurs="0"/>
+                <xsd:element ref="ns2:MediaServiceObjectDetectorVersions" minOccurs="0"/>
+                <xsd:element ref="ns2:lcf76f155ced4ddcb4097134ff3c332f" minOccurs="0"/>
+                <xsd:element ref="ns3:TaxCatchAll" minOccurs="0"/>
+                <xsd:element ref="ns2:MediaServiceDateTaken" minOccurs="0"/>
+                <xsd:element ref="ns2:MediaServiceLocation" minOccurs="0"/>
+                <xsd:element ref="ns2:MediaServiceOCR" minOccurs="0"/>
+                <xsd:element ref="ns2:MediaServiceGenerationTime" minOccurs="0"/>
+                <xsd:element ref="ns2:MediaServiceEventHashCode" minOccurs="0"/>
+                <xsd:element ref="ns2:MediaLengthInSeconds" minOccurs="0"/>
+                <xsd:element ref="ns2:MediaServiceBillingMetadata" minOccurs="0"/>
+              </xsd:all>
+            </xsd:complexType>
+          </xsd:element>
+        </xsd:sequence>
+      </xsd:complexType>
+    </xsd:element>
+  </xsd:schema>
+  <xsd:schema xmlns:xsd="http://www.w3.org/2001/XMLSchema" xmlns:xs="http://www.w3.org/2001/XMLSchema" xmlns:dms="http://schemas.microsoft.com/office/2006/documentManagement/types" xmlns:pc="http://schemas.microsoft.com/office/infopath/2007/PartnerControls" targetNamespace="53694279-be3b-48f4-abf1-f846896aa128" elementFormDefault="qualified">
+    <xsd:import namespace="http://schemas.microsoft.com/office/2006/documentManagement/types"/>
+    <xsd:import namespace="http://schemas.microsoft.com/office/infopath/2007/PartnerControls"/>
+    <xsd:element name="MediaServiceMetadata" ma:index="8" nillable="true" ma:displayName="MediaServiceMetadata" ma:hidden="true" ma:internalName="MediaServiceMetadata" ma:readOnly="true">
+      <xsd:simpleType>
+        <xsd:restriction base="dms:Note"/>
+      </xsd:simpleType>
+    </xsd:element>
+    <xsd:element name="MediaServiceFastMetadata" ma:index="9" nillable="true" ma:displayName="MediaServiceFastMetadata" ma:hidden="true" ma:internalName="MediaServiceFastMetadata" ma:readOnly="true">
+      <xsd:simpleType>
+        <xsd:restriction base="dms:Note"/>
+      </xsd:simpleType>
+    </xsd:element>
+    <xsd:element name="MediaServiceSearchProperties" ma:index="10" nillable="true" ma:displayName="MediaServiceSearchProperties" ma:hidden="true" ma:internalName="MediaServiceSearchProperties" ma:readOnly="true">
+      <xsd:simpleType>
+        <xsd:restriction base="dms:Note"/>
+      </xsd:simpleType>
+    </xsd:element>
+    <xsd:element name="MediaServiceObjectDetectorVersions" ma:index="11" nillable="true" ma:displayName="MediaServiceObjectDetectorVersions" ma:hidden="true" ma:indexed="true" ma:internalName="MediaServiceObjectDetectorVersions" ma:readOnly="true">
+      <xsd:simpleType>
+        <xsd:restriction base="dms:Text"/>
+      </xsd:simpleType>
+    </xsd:element>
+    <xsd:element name="lcf76f155ced4ddcb4097134ff3c332f" ma:index="13" nillable="true" ma:taxonomy="true" ma:internalName="lcf76f155ced4ddcb4097134ff3c332f" ma:taxonomyFieldName="MediaServiceImageTags" ma:displayName="Billedmærker" ma:readOnly="false" ma:fieldId="{5cf76f15-5ced-4ddc-b409-7134ff3c332f}" ma:taxonomyMulti="true" ma:sspId="cfe49cd5-0d4f-4079-a2e1-3a71b1890f99" ma:termSetId="09814cd3-568e-fe90-9814-8d621ff8fb84" ma:anchorId="fba54fb3-c3e1-fe81-a776-ca4b69148c4d" ma:open="true" ma:isKeyword="false">
+      <xsd:complexType>
+        <xsd:sequence>
+          <xsd:element ref="pc:Terms" minOccurs="0" maxOccurs="1"/>
+        </xsd:sequence>
+      </xsd:complexType>
+    </xsd:element>
+    <xsd:element name="MediaServiceDateTaken" ma:index="15" nillable="true" ma:displayName="MediaServiceDateTaken" ma:hidden="true" ma:indexed="true" ma:internalName="MediaServiceDateTaken" ma:readOnly="true">
+      <xsd:simpleType>
+        <xsd:restriction base="dms:Text"/>
+      </xsd:simpleType>
+    </xsd:element>
+    <xsd:element name="MediaServiceLocation" ma:index="16" nillable="true" ma:displayName="Location" ma:indexed="true" ma:internalName="MediaServiceLocation" ma:readOnly="true">
+      <xsd:simpleType>
+        <xsd:restriction base="dms:Text"/>
+      </xsd:simpleType>
+    </xsd:element>
+    <xsd:element name="MediaServiceOCR" ma:index="17" nillable="true" ma:displayName="Extracted Text" ma:internalName="MediaServiceOCR" ma:readOnly="true">
+      <xsd:simpleType>
+        <xsd:restriction base="dms:Note">
+          <xsd:maxLength value="255"/>
+        </xsd:restriction>
+      </xsd:simpleType>
+    </xsd:element>
+    <xsd:element name="MediaServiceGenerationTime" ma:index="18" nillable="true" ma:displayName="MediaServiceGenerationTime" ma:hidden="true" ma:internalName="MediaServiceGenerationTime" ma:readOnly="true">
+      <xsd:simpleType>
+        <xsd:restriction base="dms:Text"/>
+      </xsd:simpleType>
+    </xsd:element>
+    <xsd:element name="MediaServiceEventHashCode" ma:index="19" nillable="true" ma:displayName="MediaServiceEventHashCode" ma:hidden="true" ma:internalName="MediaServiceEventHashCode" ma:readOnly="true">
+      <xsd:simpleType>
+        <xsd:restriction base="dms:Text"/>
+      </xsd:simpleType>
+    </xsd:element>
+    <xsd:element name="MediaLengthInSeconds" ma:index="20" nillable="true" ma:displayName="MediaLengthInSeconds" ma:hidden="true" ma:internalName="MediaLengthInSeconds" ma:readOnly="true">
+      <xsd:simpleType>
+        <xsd:restriction base="dms:Unknown"/>
+      </xsd:simpleType>
+    </xsd:element>
+    <xsd:element name="MediaServiceBillingMetadata" ma:index="21" nillable="true" ma:displayName="MediaServiceBillingMetadata" ma:hidden="true" ma:internalName="MediaServiceBillingMetadata" ma:readOnly="true">
+      <xsd:simpleType>
+        <xsd:restriction base="dms:Note"/>
+      </xsd:simpleType>
+    </xsd:element>
+  </xsd:schema>
+  <xsd:schema xmlns:xsd="http://www.w3.org/2001/XMLSchema" xmlns:xs="http://www.w3.org/2001/XMLSchema" xmlns:dms="http://schemas.microsoft.com/office/2006/documentManagement/types" xmlns:pc="http://schemas.microsoft.com/office/infopath/2007/PartnerControls" targetNamespace="fb2e3c1a-d678-4045-ab86-cec8bd5b223c" elementFormDefault="qualified">
+    <xsd:import namespace="http://schemas.microsoft.com/office/2006/documentManagement/types"/>
+    <xsd:import namespace="http://schemas.microsoft.com/office/infopath/2007/PartnerControls"/>
+    <xsd:element name="TaxCatchAll" ma:index="14" nillable="true" ma:displayName="Taxonomy Catch All Column" ma:hidden="true" ma:list="{981259ba-daea-4186-9ee7-5b2073ce4a5f}" ma:internalName="TaxCatchAll" ma:showField="CatchAllData" ma:web="fb2e3c1a-d678-4045-ab86-cec8bd5b223c">
+      <xsd:complexType>
+        <xsd:complexContent>
+          <xsd:extension base="dms:MultiChoiceLookup">
+            <xsd:sequence>
+              <xsd:element name="Value" type="dms:Lookup" maxOccurs="unbounded" minOccurs="0" nillable="true"/>
+            </xsd:sequence>
+          </xsd:extension>
+        </xsd:complexContent>
+      </xsd:complexType>
+    </xsd:element>
+  </xsd:schema>
+  <xsd:schema xmlns="http://schemas.openxmlformats.org/package/2006/metadata/core-properties" xmlns:xsd="http://www.w3.org/2001/XMLSchema" xmlns:xsi="http://www.w3.org/2001/XMLSchema-instance" xmlns:dc="http://purl.org/dc/elements/1.1/" xmlns:dcterms="http://purl.org/dc/terms/" xmlns:odoc="http://schemas.microsoft.com/internal/obd" targetNamespace="http://schemas.openxmlformats.org/package/2006/metadata/core-properties" elementFormDefault="qualified" attributeFormDefault="unqualified" blockDefault="#all">
+    <xsd:import namespace="http://purl.org/dc/elements/1.1/" schemaLocation="http://dublincore.org/schemas/xmls/qdc/2003/04/02/dc.xsd"/>
+    <xsd:import namespace="http://purl.org/dc/terms/" schemaLocation="http://dublincore.org/schemas/xmls/qdc/2003/04/02/dcterms.xsd"/>
+    <xsd:element name="coreProperties" type="CT_coreProperties"/>
+    <xsd:complexType name="CT_coreProperties">
+      <xsd:all>
+        <xsd:element ref="dc:creator" minOccurs="0" maxOccurs="1"/>
+        <xsd:element ref="dcterms:created" minOccurs="0" maxOccurs="1"/>
+        <xsd:element ref="dc:identifier" minOccurs="0" maxOccurs="1"/>
+        <xsd:element name="contentType" minOccurs="0" maxOccurs="1" type="xsd:string" ma:index="0" ma:displayName="Indholdstype"/>
+        <xsd:element ref="dc:title" minOccurs="0" maxOccurs="1" ma:index="4" ma:displayName="Titel"/>
+        <xsd:element ref="dc:subject" minOccurs="0" maxOccurs="1"/>
+        <xsd:element ref="dc:description" minOccurs="0" maxOccurs="1"/>
+        <xsd:element name="keywords" minOccurs="0" maxOccurs="1" type="xsd:string"/>
+        <xsd:element ref="dc:language" minOccurs="0" maxOccurs="1"/>
+        <xsd:element name="category" minOccurs="0" maxOccurs="1" type="xsd:string"/>
+        <xsd:element name="version" minOccurs="0" maxOccurs="1" type="xsd:string"/>
+        <xsd:element name="revision" minOccurs="0" maxOccurs="1" type="xsd:string">
+          <xsd:annotation>
+            <xsd:documentation>
+                        This value indicates the number of saves or revisions. The application is responsible for updating this value after each revision.
+                    </xsd:documentation>
+          </xsd:annotation>
+        </xsd:element>
+        <xsd:element name="lastModifiedBy" minOccurs="0" maxOccurs="1" type="xsd:string"/>
+        <xsd:element ref="dcterms:modified" minOccurs="0" maxOccurs="1"/>
+        <xsd:element name="contentStatus" minOccurs="0" maxOccurs="1" type="xsd:string"/>
+      </xsd:all>
+    </xsd:complexType>
+  </xsd:schema>
+  <xs:schema xmlns:pc="http://schemas.microsoft.com/office/infopath/2007/PartnerControls" xmlns:xs="http://www.w3.org/2001/XMLSchema" targetNamespace="http://schemas.microsoft.com/office/infopath/2007/PartnerControls" elementFormDefault="qualified" attributeFormDefault="unqualified">
+    <xs:element name="Person">
+      <xs:complexType>
+        <xs:sequence>
+          <xs:element ref="pc:DisplayName" minOccurs="0"/>
+          <xs:element ref="pc:AccountId" minOccurs="0"/>
+          <xs:element ref="pc:AccountType" minOccurs="0"/>
+        </xs:sequence>
+      </xs:complexType>
+    </xs:element>
+    <xs:element name="DisplayName" type="xs:string"/>
+    <xs:element name="AccountId" type="xs:string"/>
+    <xs:element name="AccountType" type="xs:string"/>
+    <xs:element name="BDCAssociatedEntity">
+      <xs:complexType>
+        <xs:sequence>
+          <xs:element ref="pc:BDCEntity" minOccurs="0" maxOccurs="unbounded"/>
+        </xs:sequence>
+        <xs:attribute ref="pc:EntityNamespace"/>
+        <xs:attribute ref="pc:EntityName"/>
+        <xs:attribute ref="pc:SystemInstanceName"/>
+        <xs:attribute ref="pc:AssociationName"/>
+      </xs:complexType>
+    </xs:element>
+    <xs:attribute name="EntityNamespace" type="xs:string"/>
+    <xs:attribute name="EntityName" type="xs:string"/>
+    <xs:attribute name="SystemInstanceName" type="xs:string"/>
+    <xs:attribute name="AssociationName" type="xs:string"/>
+    <xs:element name="BDCEntity">
+      <xs:complexType>
+        <xs:sequence>
+          <xs:element ref="pc:EntityDisplayName" minOccurs="0"/>
+          <xs:element ref="pc:EntityInstanceReference" minOccurs="0"/>
+          <xs:element ref="pc:EntityId1" minOccurs="0"/>
+          <xs:element ref="pc:EntityId2" minOccurs="0"/>
+          <xs:element ref="pc:EntityId3" minOccurs="0"/>
+          <xs:element ref="pc:EntityId4" minOccurs="0"/>
+          <xs:element ref="pc:EntityId5" minOccurs="0"/>
+        </xs:sequence>
+      </xs:complexType>
+    </xs:element>
+    <xs:element name="EntityDisplayName" type="xs:string"/>
+    <xs:element name="EntityInstanceReference" type="xs:string"/>
+    <xs:element name="EntityId1" type="xs:string"/>
+    <xs:element name="EntityId2" type="xs:string"/>
+    <xs:element name="EntityId3" type="xs:string"/>
+    <xs:element name="EntityId4" type="xs:string"/>
+    <xs:element name="EntityId5" type="xs:string"/>
+    <xs:element name="Terms">
+      <xs:complexType>
+        <xs:sequence>
+          <xs:element ref="pc:TermInfo" minOccurs="0" maxOccurs="unbounded"/>
+        </xs:sequence>
+      </xs:complexType>
+    </xs:element>
+    <xs:element name="TermInfo">
+      <xs:complexType>
+        <xs:sequence>
+          <xs:element ref="pc:TermName" minOccurs="0"/>
+          <xs:element ref="pc:TermId" minOccurs="0"/>
+        </xs:sequence>
+      </xs:complexType>
+    </xs:element>
+    <xs:element name="TermName" type="xs:string"/>
+    <xs:element name="TermId" type="xs:string"/>
+  </xs:schema>
+</ct:contentTypeSchema>
+</file>
+
+<file path=customXml/item2.xml><?xml version="1.0" encoding="utf-8"?>
+<?mso-contentType ?>
+<FormTemplates xmlns="http://schemas.microsoft.com/sharepoint/v3/contenttype/forms">
+  <Display>DocumentLibraryForm</Display>
+  <Edit>DocumentLibraryForm</Edit>
+  <New>DocumentLibraryForm</New>
+</FormTemplates>
+</file>
+
+<file path=customXml/item3.xml><?xml version="1.0" encoding="utf-8"?>
+<p:properties xmlns:p="http://schemas.microsoft.com/office/2006/metadata/properties" xmlns:xsi="http://www.w3.org/2001/XMLSchema-instance" xmlns:pc="http://schemas.microsoft.com/office/infopath/2007/PartnerControls">
+  <documentManagement>
+    <TaxCatchAll xmlns="fb2e3c1a-d678-4045-ab86-cec8bd5b223c" xsi:nil="true"/>
+    <lcf76f155ced4ddcb4097134ff3c332f xmlns="53694279-be3b-48f4-abf1-f846896aa128">
+      <Terms xmlns="http://schemas.microsoft.com/office/infopath/2007/PartnerControls"/>
+    </lcf76f155ced4ddcb4097134ff3c332f>
+  </documentManagement>
+</p:properties>
+</file>
+
+<file path=customXml/itemProps1.xml><?xml version="1.0" encoding="utf-8"?>
+<ds:datastoreItem xmlns:ds="http://schemas.openxmlformats.org/officeDocument/2006/customXml" ds:itemID="{83735C37-525B-426E-ADD1-5C15A7DDADCB}"/>
+</file>
+
+<file path=customXml/itemProps2.xml><?xml version="1.0" encoding="utf-8"?>
+<ds:datastoreItem xmlns:ds="http://schemas.openxmlformats.org/officeDocument/2006/customXml" ds:itemID="{55D132F6-9E37-420E-9ECF-1C47D962A00F}"/>
+</file>
+
+<file path=customXml/itemProps3.xml><?xml version="1.0" encoding="utf-8"?>
+<ds:datastoreItem xmlns:ds="http://schemas.openxmlformats.org/officeDocument/2006/customXml" ds:itemID="{52972E5D-DF59-45E4-8D1E-D95F309FD7C2}"/>
 </file>
</xml_diff>